<commit_message>
Compila dati reali, assembla PDF CV completo e proposta didattica unica
CF, residenza e diploma inseriti in domanda, autocertificazione e allegati;
esportate versioni PDF; CV firmato + autocertificazione DPR 445 + documento
d'identita' uniti in un unico PDF; i tre programmi fusi in un solo PDF.

Co-Authored-By: Claude Fable 5 <noreply@anthropic.com>
Claude-Session: https://claude.ai/code/session_01A4qmYiqmN4hN4J7RuHKktw
</commit_message>
<xml_diff>
--- a/candidatura-its-albatros-2026/01_Allegato2_Domanda_di_inserimento_Mirabella.docx
+++ b/candidatura-its-albatros-2026/01_Allegato2_Domanda_di_inserimento_Mirabella.docx
@@ -86,7 +86,7 @@
           <w:i w:val="0"/>
           <w:sz w:val="22"/>
         </w:rPr>
-        <w:t>Il sottoscritto Bruno Carmelo Mirabella, nato a Catania (CT)  [VERIFICARE] il 22/12/1987, Codice fiscale [CODICE FISCALE – DA COMPILARE], Partita IVA n. 06193360879, residente a Catania (CT), Via [VIA E N. CIVICO – DA COMPILARE], CAP [CAP], recapito telefonico mobile (+39) 393 745 8888, indirizzo e-mail brunocmirabella@gmail.com,</w:t>
+        <w:t>Il sottoscritto Bruno Carmelo Mirabella, nato a Catania (CT) il 22/12/1987, Codice fiscale MRBBNC87T22C351P, Partita IVA n. 06193360879, residente a Catania (CT), Via Ofelia n. 35, CAP 95124, recapito telefonico mobile (+39) 393 745 8888, indirizzo e-mail brunocmirabella@gmail.com,</w:t>
       </w:r>
     </w:p>
     <w:p>
@@ -321,7 +321,7 @@
         <w:pStyle w:val="ListBullet"/>
       </w:pPr>
       <w:r>
-        <w:t>avere il seguente Titolo di Studio (requisito minimo specifico per il Ruolo C): Diploma di Liceo Scientifico, conseguito presso il Liceo Scientifico [DENOMINAZIONE ISTITUTO – DA COMPILARE] di Catania, nel mese di luglio dell'anno 2006, con votazione [VOTAZIONE – DA COMPILARE];</w:t>
+        <w:t>avere il seguente Titolo di Studio (requisito minimo specifico per il Ruolo C): Diploma di Liceo Scientifico, conseguito presso il Liceo Scientifico «G.B. Vaccarini» di Catania, nel mese di luglio dell'anno 2006, con votazione 75/100;</w:t>
       </w:r>
     </w:p>
     <w:p>

</xml_diff>

<commit_message>
Applica data e firma estratta dal CV ai documenti; nota su materiale aggiuntivo
Data 'Catania, 4 luglio 2026' e firma autografa (estratta dalla pagina 3 del
CV firmato) inserite su domanda, autocertificazione CV, Allegato 3 e
Allegato 4; PDF rigenerati e pacchetto CV riassemblato. README aggiornato
con l'analisi del bando sull'ammissibilita' di allegati non richiesti.

Co-Authored-By: Claude Fable 5 <noreply@anthropic.com>
Claude-Session: https://claude.ai/code/session_01A4qmYiqmN4hN4J7RuHKktw
</commit_message>
<xml_diff>
--- a/candidatura-its-albatros-2026/01_Allegato2_Domanda_di_inserimento_Mirabella.docx
+++ b/candidatura-its-albatros-2026/01_Allegato2_Domanda_di_inserimento_Mirabella.docx
@@ -427,7 +427,20 @@
           <w:i w:val="0"/>
           <w:sz w:val="22"/>
         </w:rPr>
-        <w:t>Luogo e data: Catania, ____ luglio 2026</w:t>
+        <w:t>Luogo e data: Catania, 4 luglio 2026</w:t>
+      </w:r>
+    </w:p>
+    <w:p>
+      <w:pPr>
+        <w:spacing w:after="0"/>
+      </w:pPr>
+      <w:r>
+        <w:rPr>
+          <w:b w:val="0"/>
+          <w:i w:val="0"/>
+          <w:sz w:val="22"/>
+        </w:rPr>
+        <w:t>FIRMA</w:t>
       </w:r>
     </w:p>
     <w:p>
@@ -435,12 +448,38 @@
         <w:spacing w:after="360"/>
       </w:pPr>
       <w:r>
-        <w:rPr>
-          <w:b w:val="0"/>
-          <w:i w:val="0"/>
-          <w:sz w:val="22"/>
-        </w:rPr>
-        <w:t>FIRMA  ____________________________</w:t>
+        <w:drawing>
+          <wp:inline xmlns:a="http://schemas.openxmlformats.org/drawingml/2006/main" xmlns:pic="http://schemas.openxmlformats.org/drawingml/2006/picture">
+            <wp:extent cx="1512000" cy="274909"/>
+            <wp:docPr id="1" name="Picture 1"/>
+            <wp:cNvGraphicFramePr>
+              <a:graphicFrameLocks noChangeAspect="1"/>
+            </wp:cNvGraphicFramePr>
+            <a:graphic>
+              <a:graphicData uri="http://schemas.openxmlformats.org/drawingml/2006/picture">
+                <pic:pic>
+                  <pic:nvPicPr>
+                    <pic:cNvPr id="0" name="firma.png"/>
+                    <pic:cNvPicPr/>
+                  </pic:nvPicPr>
+                  <pic:blipFill>
+                    <a:blip r:embed="rId9"/>
+                    <a:stretch>
+                      <a:fillRect/>
+                    </a:stretch>
+                  </pic:blipFill>
+                  <pic:spPr>
+                    <a:xfrm>
+                      <a:off x="0" y="0"/>
+                      <a:ext cx="1512000" cy="274909"/>
+                    </a:xfrm>
+                    <a:prstGeom prst="rect"/>
+                  </pic:spPr>
+                </pic:pic>
+              </a:graphicData>
+            </a:graphic>
+          </wp:inline>
+        </w:drawing>
       </w:r>
     </w:p>
     <w:p>
@@ -466,7 +505,20 @@
           <w:i w:val="0"/>
           <w:sz w:val="22"/>
         </w:rPr>
-        <w:t>Luogo e data: Catania, ____ luglio 2026</w:t>
+        <w:t>Luogo e data: Catania, 4 luglio 2026</w:t>
+      </w:r>
+    </w:p>
+    <w:p>
+      <w:pPr>
+        <w:spacing w:after="0"/>
+      </w:pPr>
+      <w:r>
+        <w:rPr>
+          <w:b w:val="0"/>
+          <w:i w:val="0"/>
+          <w:sz w:val="22"/>
+        </w:rPr>
+        <w:t>FIRMA</w:t>
       </w:r>
     </w:p>
     <w:p>
@@ -474,12 +526,38 @@
         <w:spacing w:after="120"/>
       </w:pPr>
       <w:r>
-        <w:rPr>
-          <w:b w:val="0"/>
-          <w:i w:val="0"/>
-          <w:sz w:val="22"/>
-        </w:rPr>
-        <w:t>FIRMA  ____________________________</w:t>
+        <w:drawing>
+          <wp:inline xmlns:a="http://schemas.openxmlformats.org/drawingml/2006/main" xmlns:pic="http://schemas.openxmlformats.org/drawingml/2006/picture">
+            <wp:extent cx="1512000" cy="274909"/>
+            <wp:docPr id="2" name="Picture 2"/>
+            <wp:cNvGraphicFramePr>
+              <a:graphicFrameLocks noChangeAspect="1"/>
+            </wp:cNvGraphicFramePr>
+            <a:graphic>
+              <a:graphicData uri="http://schemas.openxmlformats.org/drawingml/2006/picture">
+                <pic:pic>
+                  <pic:nvPicPr>
+                    <pic:cNvPr id="0" name="firma.png"/>
+                    <pic:cNvPicPr/>
+                  </pic:nvPicPr>
+                  <pic:blipFill>
+                    <a:blip r:embed="rId9"/>
+                    <a:stretch>
+                      <a:fillRect/>
+                    </a:stretch>
+                  </pic:blipFill>
+                  <pic:spPr>
+                    <a:xfrm>
+                      <a:off x="0" y="0"/>
+                      <a:ext cx="1512000" cy="274909"/>
+                    </a:xfrm>
+                    <a:prstGeom prst="rect"/>
+                  </pic:spPr>
+                </pic:pic>
+              </a:graphicData>
+            </a:graphic>
+          </wp:inline>
+        </w:drawing>
       </w:r>
     </w:p>
     <w:sectPr>

</xml_diff>